<commit_message>
feat: Vercel Web Analytics, Uptime Ping (GitHub Actions), Prisma Studio prod script + docs
</commit_message>
<xml_diff>
--- a/docs/HUONG-DAN-DEPLOY-CHI-TIET.docx
+++ b/docs/HUONG-DAN-DEPLOY-CHI-TIET.docx
@@ -36,7 +36,7 @@
         </w:p>
       </w:sdtContent>
     </w:sdt>
-    <w:bookmarkStart w:id="56" w:name="hướng-dẫn-triển-khai-learnquiz"/>
+    <w:bookmarkStart w:id="64" w:name="hướng-dẫn-triển-khai-learnquiz"/>
     <w:p>
       <w:pPr>
         <w:pStyle w:val="Heading1"/>
@@ -483,6 +483,40 @@
             <w:rStyle w:val="Hyperlink"/>
           </w:rPr>
           <w:t xml:space="preserve">Bảng tra lỗi thường gặp</w:t>
+        </w:r>
+      </w:hyperlink>
+    </w:p>
+    <w:p>
+      <w:pPr>
+        <w:numPr>
+          <w:ilvl w:val="0"/>
+          <w:numId w:val="1001"/>
+        </w:numPr>
+        <w:pStyle w:val="Compact"/>
+      </w:pPr>
+      <w:hyperlink w:anchor="X89e11ddbc19bbe57019b9dfaaf8e330c51173e7">
+        <w:r>
+          <w:rPr>
+            <w:rStyle w:val="Hyperlink"/>
+          </w:rPr>
+          <w:t xml:space="preserve">Giám sát &amp; thông báo sau khi deploy</w:t>
+        </w:r>
+      </w:hyperlink>
+    </w:p>
+    <w:p>
+      <w:pPr>
+        <w:numPr>
+          <w:ilvl w:val="0"/>
+          <w:numId w:val="1001"/>
+        </w:numPr>
+        <w:pStyle w:val="Compact"/>
+      </w:pPr>
+      <w:hyperlink w:anchor="Xcfa7cd7497540275322ea1a50e108aabd69fd72">
+        <w:r>
+          <w:rPr>
+            <w:rStyle w:val="Hyperlink"/>
+          </w:rPr>
+          <w:t xml:space="preserve">Quản lý dữ liệu bằng Prisma Studio từ máy tính</w:t>
         </w:r>
       </w:hyperlink>
     </w:p>
@@ -9199,20 +9233,1562 @@
         </w:pict>
       </w:r>
     </w:p>
+    <w:bookmarkEnd w:id="55"/>
+    <w:bookmarkStart w:id="60" w:name="giám-sát-thông-báo-sau-khi-deploy"/>
+    <w:p>
+      <w:pPr>
+        <w:pStyle w:val="Heading2"/>
+      </w:pPr>
+      <w:r>
+        <w:t xml:space="preserve">12. Giám sát &amp; thông báo sau khi deploy</w:t>
+      </w:r>
+    </w:p>
+    <w:bookmarkStart w:id="56" w:name="vercel-web-analytics-đã-cài"/>
+    <w:p>
+      <w:pPr>
+        <w:pStyle w:val="Heading3"/>
+      </w:pPr>
+      <w:r>
+        <w:t xml:space="preserve">12.1. Vercel Web Analytics — đã cài</w:t>
+      </w:r>
+    </w:p>
     <w:p>
       <w:pPr>
         <w:pStyle w:val="FirstParagraph"/>
+      </w:pPr>
+      <w:r>
+        <w:rPr>
+          <w:rStyle w:val="VerbatimChar"/>
+        </w:rPr>
+        <w:t xml:space="preserve">frontend</w:t>
+      </w:r>
+      <w:r>
+        <w:t xml:space="preserve"> </w:t>
+      </w:r>
+      <w:r>
+        <w:t xml:space="preserve">đã cài</w:t>
+      </w:r>
+      <w:r>
+        <w:t xml:space="preserve"> </w:t>
+      </w:r>
+      <w:r>
+        <w:rPr>
+          <w:rStyle w:val="VerbatimChar"/>
+        </w:rPr>
+        <w:t xml:space="preserve">@vercel/analytics</w:t>
+      </w:r>
+      <w:r>
+        <w:t xml:space="preserve"> </w:t>
+      </w:r>
+      <w:r>
+        <w:t xml:space="preserve">và gắn</w:t>
+      </w:r>
+      <w:r>
+        <w:t xml:space="preserve"> </w:t>
+      </w:r>
+      <w:r>
+        <w:rPr>
+          <w:rStyle w:val="VerbatimChar"/>
+        </w:rPr>
+        <w:t xml:space="preserve">&lt;Analytics /&gt;</w:t>
+      </w:r>
+      <w:r>
+        <w:t xml:space="preserve"> </w:t>
+      </w:r>
+      <w:r>
+        <w:t xml:space="preserve">trong</w:t>
+      </w:r>
+      <w:r>
+        <w:t xml:space="preserve"> </w:t>
+      </w:r>
+      <w:r>
+        <w:rPr>
+          <w:rStyle w:val="VerbatimChar"/>
+        </w:rPr>
+        <w:t xml:space="preserve">main.tsx</w:t>
+      </w:r>
+      <w:r>
+        <w:t xml:space="preserve"> </w:t>
+      </w:r>
+      <w:r>
+        <w:t xml:space="preserve">(cùng chỗ với</w:t>
+      </w:r>
+      <w:r>
+        <w:t xml:space="preserve"> </w:t>
+      </w:r>
+      <w:r>
+        <w:rPr>
+          <w:rStyle w:val="VerbatimChar"/>
+        </w:rPr>
+        <w:t xml:space="preserve">&lt;SpeedInsights /&gt;</w:t>
+      </w:r>
+      <w:r>
+        <w:t xml:space="preserve">) — không cần thêm biến môi trường. Khác với Speed Insights (đo hiệu năng tải trang), Web Analytics đếm</w:t>
+      </w:r>
+      <w:r>
+        <w:t xml:space="preserve"> </w:t>
+      </w:r>
+      <w:r>
+        <w:rPr>
+          <w:bCs/>
+          <w:b/>
+        </w:rPr>
+        <w:t xml:space="preserve">lượt xem trang và người dùng</w:t>
+      </w:r>
+      <w:r>
+        <w:t xml:space="preserve"> </w:t>
+      </w:r>
+      <w:r>
+        <w:t xml:space="preserve">(pageview, visitor, trang được xem nhiều nhất).</w:t>
+      </w:r>
+    </w:p>
+    <w:p>
+      <w:pPr>
+        <w:pStyle w:val="BodyText"/>
+      </w:pPr>
+      <w:r>
+        <w:t xml:space="preserve">Để xem số liệu: Vercel Dashboard → chọn project → tab</w:t>
+      </w:r>
+      <w:r>
+        <w:t xml:space="preserve"> </w:t>
+      </w:r>
+      <w:r>
+        <w:rPr>
+          <w:bCs/>
+          <w:b/>
+        </w:rPr>
+        <w:t xml:space="preserve">Analytics</w:t>
+      </w:r>
+      <w:r>
+        <w:t xml:space="preserve">. Lần đầu vào tab này, Vercel có thể yêu cầu bấm</w:t>
+      </w:r>
+      <w:r>
+        <w:t xml:space="preserve"> </w:t>
+      </w:r>
+      <w:r>
+        <w:rPr>
+          <w:bCs/>
+          <w:b/>
+        </w:rPr>
+        <w:t xml:space="preserve">Enable</w:t>
+      </w:r>
+      <w:r>
+        <w:t xml:space="preserve"> </w:t>
+      </w:r>
+      <w:r>
+        <w:t xml:space="preserve">một lần (sản phẩm tách riêng khỏi việc deploy) — sau khi bật, số liệu xuất hiện dần theo lượt truy cập thật, không hồi tố dữ liệu cũ.</w:t>
+      </w:r>
+    </w:p>
+    <w:bookmarkEnd w:id="56"/>
+    <w:bookmarkStart w:id="57" w:name="Xc45f2f28ed68de4a5b23fb5fde74255924a144b"/>
+    <w:p>
+      <w:pPr>
+        <w:pStyle w:val="Heading3"/>
+      </w:pPr>
+      <w:r>
+        <w:t xml:space="preserve">12.2. Preview Deployments — đã bật sẵn, không cần cài</w:t>
+      </w:r>
+    </w:p>
+    <w:p>
+      <w:pPr>
+        <w:pStyle w:val="FirstParagraph"/>
+      </w:pPr>
+      <w:r>
+        <w:t xml:space="preserve">Đây là hành vi</w:t>
+      </w:r>
+      <w:r>
+        <w:t xml:space="preserve"> </w:t>
+      </w:r>
+      <w:r>
+        <w:rPr>
+          <w:bCs/>
+          <w:b/>
+        </w:rPr>
+        <w:t xml:space="preserve">mặc định</w:t>
+      </w:r>
+      <w:r>
+        <w:t xml:space="preserve"> </w:t>
+      </w:r>
+      <w:r>
+        <w:t xml:space="preserve">của Vercel khi project được kết nối qua GitHub — không có nút</w:t>
+      </w:r>
+      <w:r>
+        <w:t xml:space="preserve"> </w:t>
+      </w:r>
+      <w:r>
+        <w:t xml:space="preserve">“</w:t>
+      </w:r>
+      <w:r>
+        <w:t xml:space="preserve">cài đặt</w:t>
+      </w:r>
+      <w:r>
+        <w:t xml:space="preserve">”</w:t>
+      </w:r>
+      <w:r>
+        <w:t xml:space="preserve"> </w:t>
+      </w:r>
+      <w:r>
+        <w:t xml:space="preserve">riêng. Cơ chế: mỗi khi có commit mới trên một nhánh</w:t>
+      </w:r>
+      <w:r>
+        <w:t xml:space="preserve"> </w:t>
+      </w:r>
+      <w:r>
+        <w:rPr>
+          <w:bCs/>
+          <w:b/>
+        </w:rPr>
+        <w:t xml:space="preserve">khác</w:t>
+      </w:r>
+      <w:r>
+        <w:t xml:space="preserve"> </w:t>
+      </w:r>
+      <w:r>
+        <w:rPr>
+          <w:rStyle w:val="VerbatimChar"/>
+        </w:rPr>
+        <w:t xml:space="preserve">main</w:t>
+      </w:r>
+      <w:r>
+        <w:t xml:space="preserve"> </w:t>
+      </w:r>
+      <w:r>
+        <w:t xml:space="preserve">(hoặc mở Pull Request), Vercel tự build và cấp một URL xem trước độc lập, không ảnh hưởng tới bản production đang chạy tại</w:t>
+      </w:r>
+      <w:r>
+        <w:t xml:space="preserve"> </w:t>
+      </w:r>
+      <w:r>
+        <w:rPr>
+          <w:rStyle w:val="VerbatimChar"/>
+        </w:rPr>
+        <w:t xml:space="preserve">final-project-js-ten.vercel.app</w:t>
+      </w:r>
+      <w:r>
+        <w:t xml:space="preserve">.</w:t>
+      </w:r>
+    </w:p>
+    <w:p>
+      <w:pPr>
+        <w:pStyle w:val="BodyText"/>
+      </w:pPr>
+      <w:r>
+        <w:t xml:space="preserve">Cách kiểm tra đang hoạt động:</w:t>
+      </w:r>
+    </w:p>
+    <w:p>
+      <w:pPr>
+        <w:pStyle w:val="SourceCode"/>
+      </w:pPr>
+      <w:r>
+        <w:rPr>
+          <w:rStyle w:val="FunctionTok"/>
+        </w:rPr>
+        <w:t xml:space="preserve">git</w:t>
+      </w:r>
+      <w:r>
+        <w:rPr>
+          <w:rStyle w:val="NormalTok"/>
+        </w:rPr>
+        <w:t xml:space="preserve"> checkout </w:t>
+      </w:r>
+      <w:r>
+        <w:rPr>
+          <w:rStyle w:val="AttributeTok"/>
+        </w:rPr>
+        <w:t xml:space="preserve">-b</w:t>
+      </w:r>
+      <w:r>
+        <w:rPr>
+          <w:rStyle w:val="NormalTok"/>
+        </w:rPr>
+        <w:t xml:space="preserve"> thu-nghiem-preview</w:t>
+      </w:r>
+      <w:r>
+        <w:br/>
+      </w:r>
+      <w:r>
+        <w:rPr>
+          <w:rStyle w:val="FunctionTok"/>
+        </w:rPr>
+        <w:t xml:space="preserve">git</w:t>
+      </w:r>
+      <w:r>
+        <w:rPr>
+          <w:rStyle w:val="NormalTok"/>
+        </w:rPr>
+        <w:t xml:space="preserve"> commit </w:t>
+      </w:r>
+      <w:r>
+        <w:rPr>
+          <w:rStyle w:val="AttributeTok"/>
+        </w:rPr>
+        <w:t xml:space="preserve">--allow-empty</w:t>
+      </w:r>
+      <w:r>
+        <w:rPr>
+          <w:rStyle w:val="NormalTok"/>
+        </w:rPr>
+        <w:t xml:space="preserve"> </w:t>
+      </w:r>
+      <w:r>
+        <w:rPr>
+          <w:rStyle w:val="AttributeTok"/>
+        </w:rPr>
+        <w:t xml:space="preserve">-m</w:t>
+      </w:r>
+      <w:r>
+        <w:rPr>
+          <w:rStyle w:val="NormalTok"/>
+        </w:rPr>
+        <w:t xml:space="preserve"> </w:t>
+      </w:r>
+      <w:r>
+        <w:rPr>
+          <w:rStyle w:val="StringTok"/>
+        </w:rPr>
+        <w:t xml:space="preserve">"test: kiểm tra preview deployment"</w:t>
+      </w:r>
+      <w:r>
+        <w:br/>
+      </w:r>
+      <w:r>
+        <w:rPr>
+          <w:rStyle w:val="FunctionTok"/>
+        </w:rPr>
+        <w:t xml:space="preserve">git</w:t>
+      </w:r>
+      <w:r>
+        <w:rPr>
+          <w:rStyle w:val="NormalTok"/>
+        </w:rPr>
+        <w:t xml:space="preserve"> push </w:t>
+      </w:r>
+      <w:r>
+        <w:rPr>
+          <w:rStyle w:val="AttributeTok"/>
+        </w:rPr>
+        <w:t xml:space="preserve">-u</w:t>
+      </w:r>
+      <w:r>
+        <w:rPr>
+          <w:rStyle w:val="NormalTok"/>
+        </w:rPr>
+        <w:t xml:space="preserve"> origin thu-nghiem-preview</w:t>
+      </w:r>
+    </w:p>
+    <w:p>
+      <w:pPr>
+        <w:pStyle w:val="FirstParagraph"/>
+      </w:pPr>
+      <w:r>
+        <w:t xml:space="preserve">Mở repo trên GitHub → tạo Pull Request từ nhánh này vào</w:t>
+      </w:r>
+      <w:r>
+        <w:t xml:space="preserve"> </w:t>
+      </w:r>
+      <w:r>
+        <w:rPr>
+          <w:rStyle w:val="VerbatimChar"/>
+        </w:rPr>
+        <w:t xml:space="preserve">main</w:t>
+      </w:r>
+      <w:r>
+        <w:t xml:space="preserve"> </w:t>
+      </w:r>
+      <w:r>
+        <w:t xml:space="preserve">— bot</w:t>
+      </w:r>
+      <w:r>
+        <w:t xml:space="preserve"> </w:t>
+      </w:r>
+      <w:r>
+        <w:rPr>
+          <w:bCs/>
+          <w:b/>
+        </w:rPr>
+        <w:t xml:space="preserve">Vercel</w:t>
+      </w:r>
+      <w:r>
+        <w:t xml:space="preserve"> </w:t>
+      </w:r>
+      <w:r>
+        <w:t xml:space="preserve">sẽ tự bình luận vào PR kèm link dạng</w:t>
+      </w:r>
+      <w:r>
+        <w:t xml:space="preserve"> </w:t>
+      </w:r>
+      <w:r>
+        <w:rPr>
+          <w:rStyle w:val="VerbatimChar"/>
+        </w:rPr>
+        <w:t xml:space="preserve">https://final-project-js-ten-git-thu-nghiem-preview-....vercel.app</w:t>
+      </w:r>
+      <w:r>
+        <w:t xml:space="preserve">. Kiểm tra xong thì xoá Pull Request và nhánh, không cần merge.</w:t>
+      </w:r>
+    </w:p>
+    <w:p>
+      <w:pPr>
+        <w:pStyle w:val="BodyText"/>
       </w:pPr>
       <w:r>
         <w:rPr>
           <w:iCs/>
           <w:i/>
         </w:rPr>
+        <w:t xml:space="preserve">(Cũng có thể xem trực tiếp không cần tạo PR: Vercel Dashboard → tab Deployments → mọi bản build từ nhánh khác</w:t>
+      </w:r>
+      <w:r>
+        <w:rPr>
+          <w:iCs/>
+          <w:i/>
+        </w:rPr>
+        <w:t xml:space="preserve"> </w:t>
+      </w:r>
+      <w:r>
+        <w:rPr>
+          <w:rStyle w:val="VerbatimChar"/>
+          <w:iCs/>
+          <w:i/>
+        </w:rPr>
+        <w:t xml:space="preserve">main</w:t>
+      </w:r>
+      <w:r>
+        <w:rPr>
+          <w:iCs/>
+          <w:i/>
+        </w:rPr>
+        <w:t xml:space="preserve"> </w:t>
+      </w:r>
+      <w:r>
+        <w:rPr>
+          <w:iCs/>
+          <w:i/>
+        </w:rPr>
+        <w:t xml:space="preserve">đều gắn nhãn</w:t>
+      </w:r>
+      <w:r>
+        <w:rPr>
+          <w:iCs/>
+          <w:i/>
+        </w:rPr>
+        <w:t xml:space="preserve"> </w:t>
+      </w:r>
+      <w:r>
+        <w:rPr>
+          <w:iCs/>
+          <w:i/>
+        </w:rPr>
+        <w:t xml:space="preserve">“</w:t>
+      </w:r>
+      <w:r>
+        <w:rPr>
+          <w:iCs/>
+          <w:i/>
+        </w:rPr>
+        <w:t xml:space="preserve">Preview</w:t>
+      </w:r>
+      <w:r>
+        <w:rPr>
+          <w:iCs/>
+          <w:i/>
+        </w:rPr>
+        <w:t xml:space="preserve">”</w:t>
+      </w:r>
+      <w:r>
+        <w:rPr>
+          <w:iCs/>
+          <w:i/>
+        </w:rPr>
+        <w:t xml:space="preserve"> </w:t>
+      </w:r>
+      <w:r>
+        <w:rPr>
+          <w:iCs/>
+          <w:i/>
+        </w:rPr>
+        <w:t xml:space="preserve">thay vì</w:t>
+      </w:r>
+      <w:r>
+        <w:rPr>
+          <w:iCs/>
+          <w:i/>
+        </w:rPr>
+        <w:t xml:space="preserve"> </w:t>
+      </w:r>
+      <w:r>
+        <w:rPr>
+          <w:iCs/>
+          <w:i/>
+        </w:rPr>
+        <w:t xml:space="preserve">“</w:t>
+      </w:r>
+      <w:r>
+        <w:rPr>
+          <w:iCs/>
+          <w:i/>
+        </w:rPr>
+        <w:t xml:space="preserve">Production</w:t>
+      </w:r>
+      <w:r>
+        <w:rPr>
+          <w:iCs/>
+          <w:i/>
+        </w:rPr>
+        <w:t xml:space="preserve">”</w:t>
+      </w:r>
+      <w:r>
+        <w:rPr>
+          <w:iCs/>
+          <w:i/>
+        </w:rPr>
+        <w:t xml:space="preserve">.)</w:t>
+      </w:r>
+    </w:p>
+    <w:bookmarkEnd w:id="57"/>
+    <w:bookmarkStart w:id="58" w:name="uptime-ping-đã-cài-bằng-github-actions"/>
+    <w:p>
+      <w:pPr>
+        <w:pStyle w:val="Heading3"/>
+      </w:pPr>
+      <w:r>
+        <w:t xml:space="preserve">12.3. Uptime Ping — đã cài bằng GitHub Actions</w:t>
+      </w:r>
+    </w:p>
+    <w:p>
+      <w:pPr>
+        <w:pStyle w:val="FirstParagraph"/>
+      </w:pPr>
+      <w:r>
+        <w:t xml:space="preserve">Thêm workflow</w:t>
+      </w:r>
+      <w:r>
+        <w:t xml:space="preserve"> </w:t>
+      </w:r>
+      <w:r>
+        <w:rPr>
+          <w:rStyle w:val="VerbatimChar"/>
+        </w:rPr>
+        <w:t xml:space="preserve">.github/workflows/uptime-ping.yml</w:t>
+      </w:r>
+      <w:r>
+        <w:t xml:space="preserve">, chạy lịch</w:t>
+      </w:r>
+      <w:r>
+        <w:t xml:space="preserve"> </w:t>
+      </w:r>
+      <w:r>
+        <w:rPr>
+          <w:bCs/>
+          <w:b/>
+        </w:rPr>
+        <w:t xml:space="preserve">mỗi 10 phút</w:t>
+      </w:r>
+      <w:r>
+        <w:t xml:space="preserve">, gọi</w:t>
+      </w:r>
+      <w:r>
+        <w:t xml:space="preserve"> </w:t>
+      </w:r>
+      <w:r>
+        <w:rPr>
+          <w:rStyle w:val="VerbatimChar"/>
+        </w:rPr>
+        <w:t xml:space="preserve">https://learnquiz-api.onrender.com/health</w:t>
+      </w:r>
+      <w:r>
+        <w:t xml:space="preserve"> </w:t>
+      </w:r>
+      <w:r>
+        <w:t xml:space="preserve">và kiểm tra cả mã HTTP lẫn nội dung JSON (</w:t>
+      </w:r>
+      <w:r>
+        <w:rPr>
+          <w:rStyle w:val="VerbatimChar"/>
+        </w:rPr>
+        <w:t xml:space="preserve">status: ok</w:t>
+      </w:r>
+      <w:r>
+        <w:t xml:space="preserve">,</w:t>
+      </w:r>
+      <w:r>
+        <w:t xml:space="preserve"> </w:t>
+      </w:r>
+      <w:r>
+        <w:rPr>
+          <w:rStyle w:val="VerbatimChar"/>
+        </w:rPr>
+        <w:t xml:space="preserve">db: up</w:t>
+      </w:r>
+      <w:r>
+        <w:t xml:space="preserve">). Repo này ở chế độ</w:t>
+      </w:r>
+      <w:r>
+        <w:t xml:space="preserve"> </w:t>
+      </w:r>
+      <w:r>
+        <w:rPr>
+          <w:bCs/>
+          <w:b/>
+        </w:rPr>
+        <w:t xml:space="preserve">public</w:t>
+      </w:r>
+      <w:r>
+        <w:t xml:space="preserve"> </w:t>
+      </w:r>
+      <w:r>
+        <w:t xml:space="preserve">nên chạy lịch không tốn giới hạn phút chạy miễn phí của private repo.</w:t>
+      </w:r>
+    </w:p>
+    <w:p>
+      <w:pPr>
+        <w:pStyle w:val="BodyText"/>
+      </w:pPr>
+      <w:r>
+        <w:t xml:space="preserve">Hai tác dụng cùng lúc:</w:t>
+      </w:r>
+      <w:r>
+        <w:t xml:space="preserve"> </w:t>
+      </w:r>
+      <w:r>
+        <w:t xml:space="preserve">-</w:t>
+      </w:r>
+      <w:r>
+        <w:t xml:space="preserve"> </w:t>
+      </w:r>
+      <w:r>
+        <w:rPr>
+          <w:bCs/>
+          <w:b/>
+        </w:rPr>
+        <w:t xml:space="preserve">Giữ ấm</w:t>
+      </w:r>
+      <w:r>
+        <w:t xml:space="preserve"> </w:t>
+      </w:r>
+      <w:r>
+        <w:t xml:space="preserve">service Render free tier — ping đều đặn dưới 15 phút nên service không kịp vào trạng thái ngủ, gần như xoá bỏ độ trễ khởi động lạnh khi giảng viên hoặc học viên truy cập.</w:t>
+      </w:r>
+      <w:r>
+        <w:t xml:space="preserve"> </w:t>
+      </w:r>
+      <w:r>
+        <w:t xml:space="preserve">-</w:t>
+      </w:r>
+      <w:r>
+        <w:t xml:space="preserve"> </w:t>
+      </w:r>
+      <w:r>
+        <w:rPr>
+          <w:bCs/>
+          <w:b/>
+        </w:rPr>
+        <w:t xml:space="preserve">Cảnh báo uptime</w:t>
+      </w:r>
+      <w:r>
+        <w:t xml:space="preserve"> </w:t>
+      </w:r>
+      <w:r>
+        <w:t xml:space="preserve">— nếu backend lỗi hoặc CSDL rớt kết nối, job sẽ đỏ trên tab</w:t>
+      </w:r>
+      <w:r>
+        <w:t xml:space="preserve"> </w:t>
+      </w:r>
+      <w:r>
+        <w:rPr>
+          <w:bCs/>
+          <w:b/>
+        </w:rPr>
+        <w:t xml:space="preserve">Actions</w:t>
+      </w:r>
+      <w:r>
+        <w:t xml:space="preserve">, và GitHub tự gửi email cho chủ repo (</w:t>
+      </w:r>
+      <w:r>
+        <w:rPr>
+          <w:rStyle w:val="VerbatimChar"/>
+        </w:rPr>
+        <w:t xml:space="preserve">tamthientinvu-coder</w:t>
+      </w:r>
+      <w:r>
+        <w:t xml:space="preserve">) mà không cần cấu hình gì thêm.</w:t>
+      </w:r>
+    </w:p>
+    <w:p>
+      <w:pPr>
+        <w:pStyle w:val="BodyText"/>
+      </w:pPr>
+      <w:r>
+        <w:t xml:space="preserve">Kiểm tra: GitHub → repo → tab</w:t>
+      </w:r>
+      <w:r>
+        <w:t xml:space="preserve"> </w:t>
+      </w:r>
+      <w:r>
+        <w:rPr>
+          <w:bCs/>
+          <w:b/>
+        </w:rPr>
+        <w:t xml:space="preserve">Actions</w:t>
+      </w:r>
+      <w:r>
+        <w:t xml:space="preserve"> </w:t>
+      </w:r>
+      <w:r>
+        <w:t xml:space="preserve">→ workflow</w:t>
+      </w:r>
+      <w:r>
+        <w:t xml:space="preserve"> </w:t>
+      </w:r>
+      <w:r>
+        <w:rPr>
+          <w:bCs/>
+          <w:b/>
+        </w:rPr>
+        <w:t xml:space="preserve">Uptime ping</w:t>
+      </w:r>
+      <w:r>
+        <w:t xml:space="preserve"> </w:t>
+      </w:r>
+      <w:r>
+        <w:t xml:space="preserve">→ mỗi lần chạy phải là dấu tích xanh. Có thể bấm</w:t>
+      </w:r>
+      <w:r>
+        <w:t xml:space="preserve"> </w:t>
+      </w:r>
+      <w:r>
+        <w:rPr>
+          <w:bCs/>
+          <w:b/>
+        </w:rPr>
+        <w:t xml:space="preserve">Run workflow</w:t>
+      </w:r>
+      <w:r>
+        <w:t xml:space="preserve"> </w:t>
+      </w:r>
+      <w:r>
+        <w:t xml:space="preserve">để kiểm tra ngay không cần chờ lịch.</w:t>
+      </w:r>
+    </w:p>
+    <w:bookmarkEnd w:id="58"/>
+    <w:bookmarkStart w:id="59" w:name="X2e205c93fa9564657d1bf60e5e8459297fabaff"/>
+    <w:p>
+      <w:pPr>
+        <w:pStyle w:val="Heading3"/>
+      </w:pPr>
+      <w:r>
+        <w:t xml:space="preserve">12.4. Deploy Notifications — bật sẵn theo mặc định của từng nền tảng</w:t>
+      </w:r>
+    </w:p>
+    <w:p>
+      <w:pPr>
+        <w:pStyle w:val="FirstParagraph"/>
+      </w:pPr>
+      <w:r>
+        <w:t xml:space="preserve">Không phải một gói cần cài, mà là cấu hình thông báo có sẵn ở tài khoản Render và Vercel:</w:t>
+      </w:r>
+    </w:p>
+    <w:tbl>
+      <w:tblPr>
+        <w:tblStyle w:val="Table"/>
+        <w:tblW w:type="pct" w:w="5000"/>
+        <w:tblLook w:firstRow="1" w:lastRow="0" w:firstColumn="0" w:lastColumn="0" w:noHBand="0" w:noVBand="0" w:val="0020"/>
+        <w:jc w:val="start"/>
+      </w:tblPr>
+      <w:tblGrid>
+        <w:gridCol w:w="2640"/>
+        <w:gridCol w:w="2640"/>
+        <w:gridCol w:w="2640"/>
+      </w:tblGrid>
+      <w:tr>
+        <w:trPr>
+          <w:tblHeader w:val="true"/>
+        </w:trPr>
+        <w:tc>
+          <w:tcPr/>
+          <w:p>
+            <w:pPr>
+              <w:pStyle w:val="Compact"/>
+              <w:jc w:val="left"/>
+            </w:pPr>
+            <w:r>
+              <w:t xml:space="preserve">Nền tảng</w:t>
+            </w:r>
+          </w:p>
+        </w:tc>
+        <w:tc>
+          <w:tcPr/>
+          <w:p>
+            <w:pPr>
+              <w:pStyle w:val="Compact"/>
+              <w:jc w:val="left"/>
+            </w:pPr>
+            <w:r>
+              <w:t xml:space="preserve">Mặc định</w:t>
+            </w:r>
+          </w:p>
+        </w:tc>
+        <w:tc>
+          <w:tcPr/>
+          <w:p>
+            <w:pPr>
+              <w:pStyle w:val="Compact"/>
+              <w:jc w:val="left"/>
+            </w:pPr>
+            <w:r>
+              <w:t xml:space="preserve">Xem/đổi ở đâu</w:t>
+            </w:r>
+          </w:p>
+        </w:tc>
+      </w:tr>
+      <w:tr>
+        <w:tc>
+          <w:tcPr/>
+          <w:p>
+            <w:pPr>
+              <w:pStyle w:val="Compact"/>
+              <w:jc w:val="left"/>
+            </w:pPr>
+            <w:r>
+              <w:rPr>
+                <w:bCs/>
+                <w:b/>
+              </w:rPr>
+              <w:t xml:space="preserve">Render</w:t>
+            </w:r>
+          </w:p>
+        </w:tc>
+        <w:tc>
+          <w:tcPr/>
+          <w:p>
+            <w:pPr>
+              <w:pStyle w:val="Compact"/>
+              <w:jc w:val="left"/>
+            </w:pPr>
+            <w:r>
+              <w:t xml:space="preserve">Tự gửi email khi build hoặc deploy thất bại, gửi tới email tài khoản</w:t>
+            </w:r>
+          </w:p>
+        </w:tc>
+        <w:tc>
+          <w:tcPr/>
+          <w:p>
+            <w:pPr>
+              <w:pStyle w:val="Compact"/>
+              <w:jc w:val="left"/>
+            </w:pPr>
+            <w:r>
+              <w:t xml:space="preserve">Render Dashboard → góc trên phải, avatar →</w:t>
+            </w:r>
+            <w:r>
+              <w:t xml:space="preserve"> </w:t>
+            </w:r>
+            <w:r>
+              <w:rPr>
+                <w:bCs/>
+                <w:b/>
+              </w:rPr>
+              <w:t xml:space="preserve">Account Settings</w:t>
+            </w:r>
+            <w:r>
+              <w:t xml:space="preserve"> </w:t>
+            </w:r>
+            <w:r>
+              <w:t xml:space="preserve">→</w:t>
+            </w:r>
+            <w:r>
+              <w:t xml:space="preserve"> </w:t>
+            </w:r>
+            <w:r>
+              <w:rPr>
+                <w:bCs/>
+                <w:b/>
+              </w:rPr>
+              <w:t xml:space="preserve">Notifications</w:t>
+            </w:r>
+          </w:p>
+        </w:tc>
+      </w:tr>
+      <w:tr>
+        <w:tc>
+          <w:tcPr/>
+          <w:p>
+            <w:pPr>
+              <w:pStyle w:val="Compact"/>
+              <w:jc w:val="left"/>
+            </w:pPr>
+            <w:r>
+              <w:rPr>
+                <w:bCs/>
+                <w:b/>
+              </w:rPr>
+              <w:t xml:space="preserve">Vercel</w:t>
+            </w:r>
+          </w:p>
+        </w:tc>
+        <w:tc>
+          <w:tcPr/>
+          <w:p>
+            <w:pPr>
+              <w:pStyle w:val="Compact"/>
+              <w:jc w:val="left"/>
+            </w:pPr>
+            <w:r>
+              <w:t xml:space="preserve">Tự gửi email khi deploy production thất bại</w:t>
+            </w:r>
+          </w:p>
+        </w:tc>
+        <w:tc>
+          <w:tcPr/>
+          <w:p>
+            <w:pPr>
+              <w:pStyle w:val="Compact"/>
+              <w:jc w:val="left"/>
+            </w:pPr>
+            <w:r>
+              <w:t xml:space="preserve">Vercel Dashboard → avatar →</w:t>
+            </w:r>
+            <w:r>
+              <w:t xml:space="preserve"> </w:t>
+            </w:r>
+            <w:r>
+              <w:rPr>
+                <w:bCs/>
+                <w:b/>
+              </w:rPr>
+              <w:t xml:space="preserve">Settings</w:t>
+            </w:r>
+            <w:r>
+              <w:t xml:space="preserve"> </w:t>
+            </w:r>
+            <w:r>
+              <w:t xml:space="preserve">→</w:t>
+            </w:r>
+            <w:r>
+              <w:t xml:space="preserve"> </w:t>
+            </w:r>
+            <w:r>
+              <w:rPr>
+                <w:bCs/>
+                <w:b/>
+              </w:rPr>
+              <w:t xml:space="preserve">Notifications</w:t>
+            </w:r>
+            <w:r>
+              <w:t xml:space="preserve"> </w:t>
+            </w:r>
+            <w:r>
+              <w:t xml:space="preserve">— có thể bật thêm</w:t>
+            </w:r>
+            <w:r>
+              <w:t xml:space="preserve"> </w:t>
+            </w:r>
+            <w:r>
+              <w:rPr>
+                <w:bCs/>
+                <w:b/>
+              </w:rPr>
+              <w:t xml:space="preserve">Deployment Summary</w:t>
+            </w:r>
+            <w:r>
+              <w:t xml:space="preserve"> </w:t>
+            </w:r>
+            <w:r>
+              <w:t xml:space="preserve">(tóm tắt mỗi lần deploy) hoặc nối</w:t>
+            </w:r>
+            <w:r>
+              <w:t xml:space="preserve"> </w:t>
+            </w:r>
+            <w:r>
+              <w:rPr>
+                <w:bCs/>
+                <w:b/>
+              </w:rPr>
+              <w:t xml:space="preserve">Slack/Discord</w:t>
+            </w:r>
+            <w:r>
+              <w:t xml:space="preserve"> </w:t>
+            </w:r>
+            <w:r>
+              <w:t xml:space="preserve">qua mục</w:t>
+            </w:r>
+            <w:r>
+              <w:t xml:space="preserve"> </w:t>
+            </w:r>
+            <w:r>
+              <w:rPr>
+                <w:bCs/>
+                <w:b/>
+              </w:rPr>
+              <w:t xml:space="preserve">Integrations</w:t>
+            </w:r>
+            <w:r>
+              <w:t xml:space="preserve"> </w:t>
+            </w:r>
+            <w:r>
+              <w:t xml:space="preserve">nếu muốn nhận vào kênh chat thay vì email</w:t>
+            </w:r>
+          </w:p>
+        </w:tc>
+      </w:tr>
+    </w:tbl>
+    <w:p>
+      <w:pPr>
+        <w:pStyle w:val="BodyText"/>
+      </w:pPr>
+      <w:r>
+        <w:t xml:space="preserve">Vì đây là cài đặt theo tài khoản (yêu cầu đăng nhập), cha cần vào hai trang trên và bật tay một lần — không có API hay tệp cấu hình nào trong repo điều khiển được việc này.</w:t>
+      </w:r>
+    </w:p>
+    <w:p>
+      <w:r>
+        <w:pict>
+          <v:rect style="width:0;height:1.5pt" o:hralign="center" o:hrstd="t" o:hr="t"/>
+        </w:pict>
+      </w:r>
+    </w:p>
+    <w:bookmarkEnd w:id="59"/>
+    <w:bookmarkEnd w:id="60"/>
+    <w:bookmarkStart w:id="63" w:name="X99ef885ca8de0b62b68e7d10c2cf60ebd21f343"/>
+    <w:p>
+      <w:pPr>
+        <w:pStyle w:val="Heading2"/>
+      </w:pPr>
+      <w:r>
+        <w:t xml:space="preserve">13. Quản lý dữ liệu bằng Prisma Studio từ máy tính</w:t>
+      </w:r>
+    </w:p>
+    <w:p>
+      <w:pPr>
+        <w:pStyle w:val="FirstParagraph"/>
+      </w:pPr>
+      <w:r>
+        <w:t xml:space="preserve">Prisma Studio là giao diện web (chạy cục bộ trên máy, không phải trên Render) để xem và sửa trực tiếp dữ liệu trong PostgreSQL — tiện khi cần kiểm tra hoặc chỉnh dữ liệu thật mà không phải viết SQL.</w:t>
+      </w:r>
+    </w:p>
+    <w:bookmarkStart w:id="61" w:name="Xe97ad1067685d686be1201833f02ee5a32673d3"/>
+    <w:p>
+      <w:pPr>
+        <w:pStyle w:val="Heading3"/>
+      </w:pPr>
+      <w:r>
+        <w:t xml:space="preserve">13.1. Với cơ sở dữ liệu cục bộ (Docker, lúc lập trình)</w:t>
+      </w:r>
+    </w:p>
+    <w:p>
+      <w:pPr>
+        <w:pStyle w:val="SourceCode"/>
+      </w:pPr>
+      <w:r>
+        <w:rPr>
+          <w:rStyle w:val="BuiltInTok"/>
+        </w:rPr>
+        <w:t xml:space="preserve">cd</w:t>
+      </w:r>
+      <w:r>
+        <w:rPr>
+          <w:rStyle w:val="NormalTok"/>
+        </w:rPr>
+        <w:t xml:space="preserve"> backend</w:t>
+      </w:r>
+      <w:r>
+        <w:br/>
+      </w:r>
+      <w:r>
+        <w:rPr>
+          <w:rStyle w:val="ExtensionTok"/>
+        </w:rPr>
+        <w:t xml:space="preserve">npx</w:t>
+      </w:r>
+      <w:r>
+        <w:rPr>
+          <w:rStyle w:val="NormalTok"/>
+        </w:rPr>
+        <w:t xml:space="preserve"> prisma studio</w:t>
+      </w:r>
+    </w:p>
+    <w:p>
+      <w:pPr>
+        <w:pStyle w:val="FirstParagraph"/>
+      </w:pPr>
+      <w:r>
+        <w:t xml:space="preserve">Tự mở</w:t>
+      </w:r>
+      <w:r>
+        <w:t xml:space="preserve"> </w:t>
+      </w:r>
+      <w:r>
+        <w:rPr>
+          <w:rStyle w:val="VerbatimChar"/>
+        </w:rPr>
+        <w:t xml:space="preserve">http://localhost:5555</w:t>
+      </w:r>
+      <w:r>
+        <w:t xml:space="preserve">, đọc</w:t>
+      </w:r>
+      <w:r>
+        <w:t xml:space="preserve"> </w:t>
+      </w:r>
+      <w:r>
+        <w:rPr>
+          <w:rStyle w:val="VerbatimChar"/>
+        </w:rPr>
+        <w:t xml:space="preserve">DATABASE_URL</w:t>
+      </w:r>
+      <w:r>
+        <w:t xml:space="preserve"> </w:t>
+      </w:r>
+      <w:r>
+        <w:t xml:space="preserve">sẵn có trong</w:t>
+      </w:r>
+      <w:r>
+        <w:t xml:space="preserve"> </w:t>
+      </w:r>
+      <w:r>
+        <w:rPr>
+          <w:rStyle w:val="VerbatimChar"/>
+        </w:rPr>
+        <w:t xml:space="preserve">backend/.env</w:t>
+      </w:r>
+      <w:r>
+        <w:t xml:space="preserve"> </w:t>
+      </w:r>
+      <w:r>
+        <w:t xml:space="preserve">(trỏ vào Postgres cổng</w:t>
+      </w:r>
+      <w:r>
+        <w:t xml:space="preserve"> </w:t>
+      </w:r>
+      <w:r>
+        <w:rPr>
+          <w:rStyle w:val="VerbatimChar"/>
+        </w:rPr>
+        <w:t xml:space="preserve">5433</w:t>
+      </w:r>
+      <w:r>
+        <w:t xml:space="preserve"> </w:t>
+      </w:r>
+      <w:r>
+        <w:t xml:space="preserve">chạy bằng Docker) — không cần cấu hình gì thêm.</w:t>
+      </w:r>
+    </w:p>
+    <w:bookmarkEnd w:id="61"/>
+    <w:bookmarkStart w:id="62" w:name="X28be1b26c94eac563d900b8e330ff3ea36af1bc"/>
+    <w:p>
+      <w:pPr>
+        <w:pStyle w:val="Heading3"/>
+      </w:pPr>
+      <w:r>
+        <w:t xml:space="preserve">13.2. Với cơ sở dữ liệu thật trên Render — cần một bước chuẩn bị</w:t>
+      </w:r>
+    </w:p>
+    <w:p>
+      <w:pPr>
+        <w:pStyle w:val="FirstParagraph"/>
+      </w:pPr>
+      <w:r>
+        <w:rPr>
+          <w:rStyle w:val="VerbatimChar"/>
+        </w:rPr>
+        <w:t xml:space="preserve">backend/.env</w:t>
+      </w:r>
+      <w:r>
+        <w:t xml:space="preserve"> </w:t>
+      </w:r>
+      <w:r>
+        <w:t xml:space="preserve">(cục bộ) đang trỏ vào Postgres Docker,</w:t>
+      </w:r>
+      <w:r>
+        <w:t xml:space="preserve"> </w:t>
+      </w:r>
+      <w:r>
+        <w:rPr>
+          <w:bCs/>
+          <w:b/>
+        </w:rPr>
+        <w:t xml:space="preserve">không phải</w:t>
+      </w:r>
+      <w:r>
+        <w:t xml:space="preserve"> </w:t>
+      </w:r>
+      <w:r>
+        <w:t xml:space="preserve">cơ sở dữ liệu Render — Prisma Studio mặc định sẽ mở nhầm CSDL rỗng ở máy nếu chạy thẳng</w:t>
+      </w:r>
+      <w:r>
+        <w:t xml:space="preserve"> </w:t>
+      </w:r>
+      <w:r>
+        <w:rPr>
+          <w:rStyle w:val="VerbatimChar"/>
+        </w:rPr>
+        <w:t xml:space="preserve">npx prisma studio</w:t>
+      </w:r>
+      <w:r>
+        <w:t xml:space="preserve">. Repo đã cài sẵn</w:t>
+      </w:r>
+      <w:r>
+        <w:t xml:space="preserve"> </w:t>
+      </w:r>
+      <w:r>
+        <w:rPr>
+          <w:rStyle w:val="VerbatimChar"/>
+        </w:rPr>
+        <w:t xml:space="preserve">dotenv-cli</w:t>
+      </w:r>
+      <w:r>
+        <w:t xml:space="preserve"> </w:t>
+      </w:r>
+      <w:r>
+        <w:t xml:space="preserve">và thêm lệnh riêng để tách hai môi trường:</w:t>
+      </w:r>
+    </w:p>
+    <w:p>
+      <w:pPr>
+        <w:pStyle w:val="SourceCode"/>
+      </w:pPr>
+      <w:r>
+        <w:rPr>
+          <w:rStyle w:val="ExtensionTok"/>
+        </w:rPr>
+        <w:t xml:space="preserve">npm</w:t>
+      </w:r>
+      <w:r>
+        <w:rPr>
+          <w:rStyle w:val="NormalTok"/>
+        </w:rPr>
+        <w:t xml:space="preserve"> run studio:prod</w:t>
+      </w:r>
+    </w:p>
+    <w:p>
+      <w:pPr>
+        <w:pStyle w:val="FirstParagraph"/>
+      </w:pPr>
+      <w:r>
+        <w:t xml:space="preserve">Lệnh này đọc biến từ tệp</w:t>
+      </w:r>
+      <w:r>
+        <w:t xml:space="preserve"> </w:t>
+      </w:r>
+      <w:r>
+        <w:rPr>
+          <w:rStyle w:val="VerbatimChar"/>
+        </w:rPr>
+        <w:t xml:space="preserve">backend/.env.production.local</w:t>
+      </w:r>
+      <w:r>
+        <w:t xml:space="preserve"> </w:t>
+      </w:r>
+      <w:r>
+        <w:t xml:space="preserve">—</w:t>
+      </w:r>
+      <w:r>
+        <w:t xml:space="preserve"> </w:t>
+      </w:r>
+      <w:r>
+        <w:rPr>
+          <w:bCs/>
+          <w:b/>
+        </w:rPr>
+        <w:t xml:space="preserve">tệp này cha tự tạo, không có sẵn trong repo và không bao giờ lên git</w:t>
+      </w:r>
+      <w:r>
+        <w:t xml:space="preserve"> </w:t>
+      </w:r>
+      <w:r>
+        <w:t xml:space="preserve">(đã nằm trong mẫu</w:t>
+      </w:r>
+      <w:r>
+        <w:t xml:space="preserve"> </w:t>
+      </w:r>
+      <w:r>
+        <w:rPr>
+          <w:rStyle w:val="VerbatimChar"/>
+        </w:rPr>
+        <w:t xml:space="preserve">.env.*.local</w:t>
+      </w:r>
+      <w:r>
+        <w:t xml:space="preserve"> </w:t>
+      </w:r>
+      <w:r>
+        <w:t xml:space="preserve">của</w:t>
+      </w:r>
+      <w:r>
+        <w:t xml:space="preserve"> </w:t>
+      </w:r>
+      <w:r>
+        <w:rPr>
+          <w:rStyle w:val="VerbatimChar"/>
+        </w:rPr>
+        <w:t xml:space="preserve">.gitignore</w:t>
+      </w:r>
+      <w:r>
+        <w:t xml:space="preserve">). Các bước một lần:</w:t>
+      </w:r>
+    </w:p>
+    <w:p>
+      <w:pPr>
+        <w:numPr>
+          <w:ilvl w:val="0"/>
+          <w:numId w:val="1026"/>
+        </w:numPr>
+        <w:pStyle w:val="Compact"/>
+      </w:pPr>
+      <w:r>
+        <w:t xml:space="preserve">Render Dashboard → database</w:t>
+      </w:r>
+      <w:r>
+        <w:t xml:space="preserve"> </w:t>
+      </w:r>
+      <w:r>
+        <w:rPr>
+          <w:rStyle w:val="VerbatimChar"/>
+        </w:rPr>
+        <w:t xml:space="preserve">learnquiz-db</w:t>
+      </w:r>
+      <w:r>
+        <w:t xml:space="preserve"> </w:t>
+      </w:r>
+      <w:r>
+        <w:t xml:space="preserve">→ tab</w:t>
+      </w:r>
+      <w:r>
+        <w:t xml:space="preserve"> </w:t>
+      </w:r>
+      <w:r>
+        <w:rPr>
+          <w:bCs/>
+          <w:b/>
+        </w:rPr>
+        <w:t xml:space="preserve">Connections</w:t>
+      </w:r>
+    </w:p>
+    <w:p>
+      <w:pPr>
+        <w:numPr>
+          <w:ilvl w:val="0"/>
+          <w:numId w:val="1026"/>
+        </w:numPr>
+        <w:pStyle w:val="Compact"/>
+      </w:pPr>
+      <w:r>
+        <w:t xml:space="preserve">Copy chuỗi</w:t>
+      </w:r>
+      <w:r>
+        <w:t xml:space="preserve"> </w:t>
+      </w:r>
+      <w:r>
+        <w:rPr>
+          <w:bCs/>
+          <w:b/>
+        </w:rPr>
+        <w:t xml:space="preserve">External Database URL</w:t>
+      </w:r>
+      <w:r>
+        <w:t xml:space="preserve"> </w:t>
+      </w:r>
+      <w:r>
+        <w:t xml:space="preserve">(khác với Internal Database URL dùng ở Bước 3 — External mới kết nối được từ ngoài mạng Render, tức là từ máy cá nhân)</w:t>
+      </w:r>
+    </w:p>
+    <w:p>
+      <w:pPr>
+        <w:numPr>
+          <w:ilvl w:val="0"/>
+          <w:numId w:val="1026"/>
+        </w:numPr>
+        <w:pStyle w:val="Compact"/>
+      </w:pPr>
+      <w:r>
+        <w:t xml:space="preserve">Tạo tệp mới</w:t>
+      </w:r>
+      <w:r>
+        <w:t xml:space="preserve"> </w:t>
+      </w:r>
+      <w:r>
+        <w:rPr>
+          <w:rStyle w:val="VerbatimChar"/>
+        </w:rPr>
+        <w:t xml:space="preserve">backend/.env.production.local</w:t>
+      </w:r>
+      <w:r>
+        <w:t xml:space="preserve"> </w:t>
+      </w:r>
+      <w:r>
+        <w:t xml:space="preserve">với đúng một dòng:</w:t>
+      </w:r>
+    </w:p>
+    <w:p>
+      <w:pPr>
+        <w:pStyle w:val="SourceCode"/>
+      </w:pPr>
+      <w:r>
+        <w:rPr>
+          <w:rStyle w:val="VerbatimChar"/>
+        </w:rPr>
+        <w:t xml:space="preserve">DATABASE_URL="&lt;dán External Database URL vừa copy&gt;?sslmode=require"</w:t>
+      </w:r>
+    </w:p>
+    <w:p>
+      <w:pPr>
+        <w:pStyle w:val="FirstParagraph"/>
+      </w:pPr>
+      <w:r>
+        <w:rPr>
+          <w:iCs/>
+          <w:i/>
+        </w:rPr>
+        <w:t xml:space="preserve">(thêm</w:t>
+      </w:r>
+      <w:r>
+        <w:rPr>
+          <w:iCs/>
+          <w:i/>
+        </w:rPr>
+        <w:t xml:space="preserve"> </w:t>
+      </w:r>
+      <w:r>
+        <w:rPr>
+          <w:rStyle w:val="VerbatimChar"/>
+          <w:iCs/>
+          <w:i/>
+        </w:rPr>
+        <w:t xml:space="preserve">?sslmode=require</w:t>
+      </w:r>
+      <w:r>
+        <w:rPr>
+          <w:iCs/>
+          <w:i/>
+        </w:rPr>
+        <w:t xml:space="preserve"> </w:t>
+      </w:r>
+      <w:r>
+        <w:rPr>
+          <w:iCs/>
+          <w:i/>
+        </w:rPr>
+        <w:t xml:space="preserve">ở cuối — Render yêu cầu kết nối từ ngoài phải mã hoá TLS, thiếu cờ này sẽ báo lỗi kết nối)</w:t>
+      </w:r>
+    </w:p>
+    <w:p>
+      <w:pPr>
+        <w:numPr>
+          <w:ilvl w:val="0"/>
+          <w:numId w:val="1027"/>
+        </w:numPr>
+        <w:pStyle w:val="Compact"/>
+      </w:pPr>
+      <w:r>
+        <w:t xml:space="preserve">Chạy</w:t>
+      </w:r>
+      <w:r>
+        <w:t xml:space="preserve"> </w:t>
+      </w:r>
+      <w:r>
+        <w:rPr>
+          <w:rStyle w:val="VerbatimChar"/>
+        </w:rPr>
+        <w:t xml:space="preserve">npm run studio:prod</w:t>
+      </w:r>
+      <w:r>
+        <w:t xml:space="preserve"> </w:t>
+      </w:r>
+      <w:r>
+        <w:t xml:space="preserve">→ Prisma Studio mở ở</w:t>
+      </w:r>
+      <w:r>
+        <w:t xml:space="preserve"> </w:t>
+      </w:r>
+      <w:r>
+        <w:rPr>
+          <w:rStyle w:val="VerbatimChar"/>
+        </w:rPr>
+        <w:t xml:space="preserve">http://localhost:5555</w:t>
+      </w:r>
+      <w:r>
+        <w:t xml:space="preserve">, lần này là dữ liệu</w:t>
+      </w:r>
+      <w:r>
+        <w:t xml:space="preserve"> </w:t>
+      </w:r>
+      <w:r>
+        <w:rPr>
+          <w:bCs/>
+          <w:b/>
+        </w:rPr>
+        <w:t xml:space="preserve">thật</w:t>
+      </w:r>
+      <w:r>
+        <w:t xml:space="preserve"> </w:t>
+      </w:r>
+      <w:r>
+        <w:t xml:space="preserve">trên Render</w:t>
+      </w:r>
+    </w:p>
+    <w:p>
+      <w:pPr>
+        <w:pStyle w:val="FirstParagraph"/>
+      </w:pPr>
+      <w:r>
+        <w:rPr>
+          <w:bCs/>
+          <w:b/>
+        </w:rPr>
+        <w:t xml:space="preserve">Cẩn trọng:</w:t>
+      </w:r>
+      <w:r>
+        <w:t xml:space="preserve"> </w:t>
+      </w:r>
+      <w:r>
+        <w:t xml:space="preserve">đây là sửa trực tiếp trên dữ liệu thật đang phục vụ người dùng thật (nếu có) — sửa/xoá nhầm không có</w:t>
+      </w:r>
+      <w:r>
+        <w:t xml:space="preserve"> </w:t>
+      </w:r>
+      <w:r>
+        <w:t xml:space="preserve">“</w:t>
+      </w:r>
+      <w:r>
+        <w:t xml:space="preserve">hoàn tác</w:t>
+      </w:r>
+      <w:r>
+        <w:t xml:space="preserve">”</w:t>
+      </w:r>
+      <w:r>
+        <w:t xml:space="preserve">. Đóng tab và dừng lệnh (</w:t>
+      </w:r>
+      <w:r>
+        <w:rPr>
+          <w:rStyle w:val="VerbatimChar"/>
+        </w:rPr>
+        <w:t xml:space="preserve">Ctrl+C</w:t>
+      </w:r>
+      <w:r>
+        <w:t xml:space="preserve">) ngay sau khi xong việc, đừng để Prisma Studio mở treo cả buổi.</w:t>
+      </w:r>
+    </w:p>
+    <w:p>
+      <w:r>
+        <w:pict>
+          <v:rect style="width:0;height:1.5pt" o:hralign="center" o:hrstd="t" o:hr="t"/>
+        </w:pict>
+      </w:r>
+    </w:p>
+    <w:p>
+      <w:pPr>
+        <w:pStyle w:val="FirstParagraph"/>
+      </w:pPr>
+      <w:r>
+        <w:rPr>
+          <w:iCs/>
+          <w:i/>
+        </w:rPr>
         <w:t xml:space="preserve">LearnQuiz — Đồ án tốt nghiệp Lập trình Full-stack JavaScript K312.</w:t>
       </w:r>
     </w:p>
-    <w:bookmarkEnd w:id="55"/>
-    <w:bookmarkEnd w:id="56"/>
+    <w:bookmarkEnd w:id="62"/>
+    <w:bookmarkEnd w:id="63"/>
+    <w:bookmarkEnd w:id="64"/>
     <w:sectPr/>
   </w:body>
 </w:document>
@@ -10495,6 +12071,66 @@
   </w:num>
   <w:num w:numId="1025">
     <w:abstractNumId w:val="991"/>
+  </w:num>
+  <w:num w:numId="1026">
+    <w:abstractNumId w:val="99411"/>
+    <w:lvlOverride w:ilvl="0">
+      <w:startOverride w:val="1"/>
+    </w:lvlOverride>
+    <w:lvlOverride w:ilvl="1">
+      <w:startOverride w:val="1"/>
+    </w:lvlOverride>
+    <w:lvlOverride w:ilvl="2">
+      <w:startOverride w:val="1"/>
+    </w:lvlOverride>
+    <w:lvlOverride w:ilvl="3">
+      <w:startOverride w:val="1"/>
+    </w:lvlOverride>
+    <w:lvlOverride w:ilvl="4">
+      <w:startOverride w:val="1"/>
+    </w:lvlOverride>
+    <w:lvlOverride w:ilvl="5">
+      <w:startOverride w:val="1"/>
+    </w:lvlOverride>
+    <w:lvlOverride w:ilvl="6">
+      <w:startOverride w:val="1"/>
+    </w:lvlOverride>
+    <w:lvlOverride w:ilvl="7">
+      <w:startOverride w:val="1"/>
+    </w:lvlOverride>
+    <w:lvlOverride w:ilvl="8">
+      <w:startOverride w:val="1"/>
+    </w:lvlOverride>
+  </w:num>
+  <w:num w:numId="1027">
+    <w:abstractNumId w:val="99414"/>
+    <w:lvlOverride w:ilvl="0">
+      <w:startOverride w:val="4"/>
+    </w:lvlOverride>
+    <w:lvlOverride w:ilvl="1">
+      <w:startOverride w:val="4"/>
+    </w:lvlOverride>
+    <w:lvlOverride w:ilvl="2">
+      <w:startOverride w:val="4"/>
+    </w:lvlOverride>
+    <w:lvlOverride w:ilvl="3">
+      <w:startOverride w:val="4"/>
+    </w:lvlOverride>
+    <w:lvlOverride w:ilvl="4">
+      <w:startOverride w:val="4"/>
+    </w:lvlOverride>
+    <w:lvlOverride w:ilvl="5">
+      <w:startOverride w:val="4"/>
+    </w:lvlOverride>
+    <w:lvlOverride w:ilvl="6">
+      <w:startOverride w:val="4"/>
+    </w:lvlOverride>
+    <w:lvlOverride w:ilvl="7">
+      <w:startOverride w:val="4"/>
+    </w:lvlOverride>
+    <w:lvlOverride w:ilvl="8">
+      <w:startOverride w:val="4"/>
+    </w:lvlOverride>
   </w:num>
 </w:numbering>
 </file>

</xml_diff>